<commit_message>
Add live Streamlit Cloud URL to README and project report
</commit_message>
<xml_diff>
--- a/internship_document_upgraded.docx
+++ b/internship_document_upgraded.docx
@@ -99,7 +99,37 @@
               <w:spacing w:before="80" w:after="80"/>
             </w:pPr>
             <w:r>
-              <w:t>Model Architecture: Deep Multi-Layer Perceptron (MLP)</w:t>
+              <w:t>Model Test Accuracy: 90.74%</w:t>
+            </w:r>
+          </w:p>
+        </w:tc>
+      </w:tr>
+      <w:tr>
+        <w:tc>
+          <w:tcPr>
+            <w:tcW w:type="dxa" w:w="4680"/>
+            <w:shd w:fill="F7FAFC"/>
+          </w:tcPr>
+          <w:p>
+            <w:pPr>
+              <w:spacing w:before="80" w:after="80"/>
+            </w:pPr>
+            <w:r>
+              <w:t>Model Architecture: Deep Multi-Layer Neural Network</w:t>
+            </w:r>
+          </w:p>
+        </w:tc>
+        <w:tc>
+          <w:tcPr>
+            <w:tcW w:type="dxa" w:w="4680"/>
+            <w:shd w:fill="F7FAFC"/>
+          </w:tcPr>
+          <w:p>
+            <w:pPr>
+              <w:spacing w:before="80" w:after="80"/>
+            </w:pPr>
+            <w:r>
+              <w:t>Live Web App: https://elevate-internship-project1-9mjpycmrm4cgkstoowoxan.streamlit.app/</w:t>
             </w:r>
           </w:p>
         </w:tc>
@@ -134,7 +164,7 @@
         <w:spacing w:after="320"/>
       </w:pPr>
       <w:r>
-        <w:t>By transitioning from global track averaging to 3-second segment windowing, extracting a 58-parameter audio feature vector (including MFCCs, Chroma STFT, Spectral Centroid, Rolloff, Zero Crossing Rate, and RMS Energy), and applying rigorous StandardScaler feature normalization, the deep learning model achieves an empirical test accuracy of 90.74%, significantly outperforming traditional baseline models.</w:t>
+        <w:t>By transitioning from global track averaging to 3-second segment windowing, extracting a 58-parameter audio feature vector (including MFCCs, Chroma STFT, Spectral Centroid, Rolloff, Zero Crossing Rate, and RMS Energy), and applying rigorous StandardScaler feature normalization, the deep learning model achieves an empirical test accuracy of 90.74%, significantly outperforming traditional baseline models. The system is deployed live at: https://elevate-internship-project1-9mjpycmrm4cgkstoowoxan.streamlit.app/</w:t>
       </w:r>
     </w:p>
     <w:p>
@@ -225,7 +255,7 @@
         <w:t xml:space="preserve">Deployment &amp; Real-time Web App: </w:t>
       </w:r>
       <w:r>
-        <w:t>Serialized ML artifacts (model.pkl, scaler.pkl, label_encoder.pkl) and built an interactive Streamlit Web Dashboard for live audio predictions and Mel-Spectrogram rendering.</w:t>
+        <w:t>Serialized ML artifacts (model.pkl, scaler.pkl, label_encoder.pkl) and deployed a live Streamlit Web Dashboard at https://elevate-internship-project1-9mjpycmrm4cgkstoowoxan.streamlit.app/.</w:t>
       </w:r>
     </w:p>
     <w:p>
@@ -929,7 +959,12 @@
     </w:p>
     <w:p>
       <w:r>
-        <w:t>To provide a complete end-to-end user experience, an interactive Streamlit web application (`app.py`) was developed. Key features include:</w:t>
+        <w:t>To provide a complete end-to-end user experience, an interactive Streamlit web application was developed and deployed live at:</w:t>
+        <w:br/>
+        <w:t>https://elevate-internship-project1-9mjpycmrm4cgkstoowoxan.streamlit.app/</w:t>
+        <w:br/>
+        <w:br/>
+        <w:t>Key features include:</w:t>
       </w:r>
     </w:p>
     <w:p>
@@ -982,7 +1017,7 @@
     </w:p>
     <w:p>
       <w:r>
-        <w:t>The upgraded AI Music Genre Classification system demonstrates the power of rigorous feature engineering, standardization, and deep learning in audio signal processing. The model achieves high classification accuracy and is fully packaged with an interactive web dashboard for real-world deployment.</w:t>
+        <w:t>The upgraded AI Music Genre Classification system demonstrates the power of rigorous feature engineering, standardization, and deep learning in audio signal processing. The model achieves 90.74% classification accuracy and is fully deployed on Streamlit Community Cloud.</w:t>
       </w:r>
     </w:p>
     <w:sectPr>

</xml_diff>